<commit_message>
fix: reparar XML inválido en plantilla Reserva Exclusiva (etiqueta w:p faltante)
Al editar el template para quitar Segoe UI Symbol, se eliminó accidentalmente
el tag <w:p> de apertura antes de un <w:pPr>, resultando en XML malformado que
LibreOffice no podía cargar (error 'source file could not be loaded' → Gotenberg 500).

Co-Authored-By: Claude Sonnet 4.6 <noreply@anthropic.com>
Claude-Session: https://claude.ai/code/session_01VwMpxzAmpxxuXHzGz5u6jp
</commit_message>
<xml_diff>
--- a/src/app/api/visitas/documento/3_Reserva_Exclusiva.docx
+++ b/src/app/api/visitas/documento/3_Reserva_Exclusiva.docx
@@ -1,17 +1,686 @@
 
-<file path=word/document.xml><?xml version="1.0" encoding="UTF-8" standalone="yes"?>
-<w:document xmlns:wpc="http://schemas.microsoft.com/office/word/2010/wordprocessingCanvas" xmlns:cx="http://schemas.microsoft.com/office/drawing/2014/chartex" xmlns:cx1="http://schemas.microsoft.com/office/drawing/2015/9/8/chartex" xmlns:cx2="http://schemas.microsoft.com/office/drawing/2015/10/21/chartex" xmlns:cx3="http://schemas.microsoft.com/office/drawing/2016/5/9/chartex" xmlns:cx4="http://schemas.microsoft.com/office/drawing/2016/5/10/chartex" xmlns:cx5="http://schemas.microsoft.com/office/drawing/2016/5/11/chartex" xmlns:cx6="http://schemas.microsoft.com/office/drawing/2016/5/12/chartex" xmlns:cx7="http://schemas.microsoft.com/office/drawing/2016/5/13/chartex" xmlns:cx8="http://schemas.microsoft.com/office/drawing/2016/5/14/chartex" xmlns:mc="http://schemas.openxmlformats.org/markup-compatibility/2006" xmlns:aink="http://schemas.microsoft.com/office/drawing/2016/ink" xmlns:am3d="http://schemas.microsoft.com/office/drawing/2017/model3d" xmlns:o="urn:schemas-microsoft-com:office:office" xmlns:r="http://schemas.openxmlformats.org/officeDocument/2006/relationships" xmlns:m="http://schemas.openxmlformats.org/officeDocument/2006/math" xmlns:v="urn:schemas-microsoft-com:vml" xmlns:wp14="http://schemas.microsoft.com/office/word/2010/wordprocessingDrawing" xmlns:wp="http://schemas.openxmlformats.org/drawingml/2006/wordprocessingDrawing" xmlns:w10="urn:schemas-microsoft-com:office:word" xmlns:w="http://schemas.openxmlformats.org/wordprocessingml/2006/main" xmlns:w14="http://schemas.microsoft.com/office/word/2010/wordml" xmlns:w15="http://schemas.microsoft.com/office/word/2012/wordml" xmlns:w16cex="http://schemas.microsoft.com/office/word/2018/wordml/cex" xmlns:w16cid="http://schemas.microsoft.com/office/word/2016/wordml/cid" xmlns:w16="http://schemas.microsoft.com/office/word/2018/wordml" xmlns:w16sdtdh="http://schemas.microsoft.com/office/word/2020/wordml/sdtdatahash" xmlns:w16se="http://schemas.microsoft.com/office/word/2015/wordml/symex" xmlns:wpg="http://schemas.microsoft.com/office/word/2010/wordprocessingGroup" xmlns:wpi="http://schemas.microsoft.com/office/word/2010/wordprocessingInk" xmlns:wne="http://schemas.microsoft.com/office/word/2006/wordml" xmlns:wps="http://schemas.microsoft.com/office/word/2010/wordprocessingShape" mc:Ignorable="w14 w15 w16se w16cid w16 w16cex w16sdtdh wp14"><w:body><w:p><w:pPr><w:spacing w:after="60"/><w:jc w:val="center"/></w:pPr><w:r><w:rPr><w:rFonts w:ascii="Calibri" w:eastAsia="Calibri" w:hAnsi="Calibri" w:cs="Calibri"/><w:b/><w:color w:val="8F7141"/><w:sz w:val="18"/></w:rPr><w:t xml:space="preserve">NATIVA PROPERTIES</w:t></w:r></w:p><w:p><w:pPr><w:pBdr><w:bottom w:val="single" w:sz="10" w:space="0" w:color="405C6B"/></w:pBdr><w:spacing w:after="80"/><w:jc w:val="center"/></w:pPr><w:r><w:rPr><w:rFonts w:ascii="Calibri" w:eastAsia="Calibri" w:hAnsi="Calibri" w:cs="Calibri"/><w:b/><w:color w:val="405C6B"/><w:sz w:val="30"/></w:rPr><w:t xml:space="preserve">RESERVA EXCLUSIVA</w:t></w:r></w:p><w:p><w:pPr><w:spacing w:after="320"/><w:jc w:val="center"/></w:pPr><w:r><w:rPr><w:rFonts w:ascii="Garamond" w:eastAsia="Garamond" w:hAnsi="Garamond" w:cs="Garamond"/><w:i/><w:color w:val="555555"/></w:rPr><w:t xml:space="preserve">Reserva en firme al precio de publicación del inmueble</w:t></w:r></w:p><w:p><w:pPr><w:spacing w:after="280"/></w:pPr><w:r><w:rPr><w:rFonts w:ascii="Garamond" w:eastAsia="Garamond" w:hAnsi="Garamond" w:cs="Garamond"/><w:color w:val="1A2528"/></w:rPr><w:t xml:space="preserve">En {ciudad}, a {dia} de {mes} de {anyo}</w:t></w:r></w:p><w:p><w:pPr><w:spacing w:after="140"/></w:pPr><w:r><w:rPr><w:rFonts w:ascii="Calibri" w:eastAsia="Calibri" w:hAnsi="Calibri" w:cs="Calibri"/><w:b/><w:color w:val="405C6B"/><w:sz w:val="21"/></w:rPr><w:t xml:space="preserve">INMUEBLE VISITADO</w:t></w:r></w:p><w:p><w:r><w:t>Dirección: {direccion}</w:t></w:r></w:p>
-<w:p><w:r><w:t xml:space="preserve">Referencia catastral: {ref_catastral}</w:t></w:r></w:p>
-<w:p><w:r><w:t xml:space="preserve">Referencia Interna: {ref_interna}</w:t></w:r></w:p>
-<w:p><w:r><w:t xml:space="preserve">Precio publicación: {precio_publicacion}</w:t></w:r></w:p><w:p><w:pPr><w:spacing w:after="120"/></w:pPr></w:p><w:p><w:pPr><w:spacing w:before="240" w:after="140"/></w:pPr><w:r><w:rPr><w:rFonts w:ascii="Calibri" w:eastAsia="Calibri" w:hAnsi="Calibri" w:cs="Calibri"/><w:b/><w:color w:val="405C6B"/><w:sz w:val="21"/></w:rPr><w:t xml:space="preserve">DATOS DEL AGENTE</w:t></w:r></w:p><w:p><w:pPr><w:spacing w:after="180"/><w:jc w:val="both"/></w:pPr><w:r><w:rPr><w:rFonts w:ascii="Garamond" w:eastAsia="Garamond" w:hAnsi="Garamond" w:cs="Garamond"/><w:color w:val="1A2528"/></w:rPr><w:t xml:space="preserve">D./Dña. {nombre_agente}, con DNI/NIE {dni_agente} y Nº Póliza RC {poliza_rc_agente}, actuando como Agente Independiente en Colaboración con Nativa Properties (Mallorca Nativa, S.L., CIF B75396234), ha acompañado y asesorado al interesado en la visita al inmueble anteriormente descrito.</w:t></w:r></w:p><w:p><w:pPr><w:spacing w:before="240" w:after="140"/></w:pPr><w:r><w:rPr><w:rFonts w:ascii="Calibri" w:eastAsia="Calibri" w:hAnsi="Calibri" w:cs="Calibri"/><w:b/><w:color w:val="405C6B"/><w:sz w:val="21"/></w:rPr><w:t xml:space="preserve">DATOS DEL INTERESADO (COMPRADOR POTENCIAL)</w:t></w:r></w:p><w:p><w:r><w:t xml:space="preserve">Nombre y Apellidos: {nombre_comprador_1}</w:t></w:r></w:p>
-<w:p><w:r><w:t xml:space="preserve">DNI/NIE: {dni_comprador_1}</w:t></w:r></w:p>
-<w:p><w:r><w:t xml:space="preserve">Teléfono: {telefono_comprador_1}</w:t></w:r></w:p>
-<w:p><w:r><w:t xml:space="preserve">Nombre y Apellidos: {nombre_comprador_2}</w:t></w:r></w:p>
-<w:p><w:r><w:t xml:space="preserve">DNI/NIE: {dni_comprador_2}</w:t></w:r></w:p>
-<w:p><w:r><w:t xml:space="preserve">Teléfono: {telefono_comprador_2}</w:t></w:r></w:p><w:pPr><w:spacing w:after="120"/></w:pPr></w:p><w:p><w:pPr><w:spacing w:before="240" w:after="140"/></w:pPr><w:r><w:rPr><w:rFonts w:ascii="Calibri" w:eastAsia="Calibri" w:hAnsi="Calibri" w:cs="Calibri"/><w:b/><w:color w:val="405C6B"/><w:sz w:val="21"/></w:rPr><w:t xml:space="preserve">DECLARACIÓN DEL INTERESADO</w:t></w:r></w:p><w:p><w:pPr><w:spacing w:after="180"/><w:jc w:val="both"/></w:pPr><w:r><w:rPr><w:rFonts w:ascii="Garamond" w:eastAsia="Garamond" w:hAnsi="Garamond" w:cs="Garamond"/><w:color w:val="1A2528"/></w:rPr><w:t xml:space="preserve">El interesado declara haber conocido y visitado el inmueble anteriormente descrito gracias a la gestión y difusión comercial de Nativa Properties (Mallorca Nativa, S.L., CIF B75396234).</w:t></w:r></w:p><w:p><w:pPr><w:spacing w:after="180"/><w:jc w:val="both"/></w:pPr><w:r><w:rPr><w:rFonts w:ascii="Garamond" w:eastAsia="Garamond" w:hAnsi="Garamond" w:cs="Garamond"/><w:color w:val="1A2528"/></w:rPr><w:t xml:space="preserve">Con el fin de poder ofrecer al interesado un acompañamiento continuado a lo largo de todo el proceso, y de proteger igualmente los intereses de la propiedad, el interesado se compromete a comunicarse exclusivamente con Nativa Properties para cualquier asunto relacionado con el inmueble citado. En ningún caso deberá contactar con los propietarios sin la presencia de un representante de la Agencia, ni divulgar los datos de la propiedad a terceros, especialmente a otras agencias intermediarias. Asimismo, el interesado no podrá adquirir la propiedad de forma personal, a través de familiares, de sociedades bajo su control efectivo, o de otras personas vinculadas, sin la intervención de Nativa Properties.</w:t></w:r></w:p><w:p><w:pPr><w:spacing w:before="240" w:after="140"/></w:pPr><w:r><w:rPr><w:rFonts w:ascii="Calibri" w:eastAsia="Calibri" w:hAnsi="Calibri" w:cs="Calibri"/><w:b/><w:color w:val="405C6B"/><w:sz w:val="21"/></w:rPr><w:t xml:space="preserve">OFERTA / RESERVA</w:t></w:r></w:p><w:p><w:pPr><w:spacing w:after="80"/><w:jc w:val="both"/></w:pPr><w:r><w:rPr><w:rFonts w:ascii="Garamond" w:eastAsia="Garamond" w:hAnsi="Garamond" w:cs="Garamond"/><w:color w:val="1A2528"/></w:rPr><w:t xml:space="preserve">La Parte Compradora ofrece pagar a la Parte Vendedora, en concepto de precio de compraventa del inmueble, la cantidad de:</w:t></w:r></w:p><w:p><w:pPr><w:spacing w:after="80"/></w:pPr><w:r><w:rPr><w:rFonts w:ascii="Garamond" w:eastAsia="Garamond" w:hAnsi="Garamond" w:cs="Garamond"/><w:color w:val="999999"/></w:rPr><w:t xml:space="preserve">{precio_oferta_largo}</w:t></w:r></w:p><w:p><w:pPr><w:spacing w:after="180"/><w:jc w:val="both"/></w:pPr><w:r><w:rPr><w:rFonts w:ascii="Garamond" w:eastAsia="Garamond" w:hAnsi="Garamond" w:cs="Garamond"/><w:color w:val="1A2528"/></w:rPr><w:t xml:space="preserve">correspondiente al precio íntegro de publicación, honorarios de intermediación incluidos.</w:t></w:r></w:p><w:p><w:pPr><w:spacing w:after="180"/><w:jc w:val="both"/></w:pPr><w:r><w:rPr><w:rFonts w:ascii="Garamond" w:eastAsia="Garamond" w:hAnsi="Garamond" w:cs="Garamond"/><w:color w:val="1A2528"/></w:rPr><w:t xml:space="preserve">Con el fin de formalizar esta reserva, la Parte Compradora entrega en este acto a la Agencia, en concepto de reserva del inmueble, la cantidad de MIL EUROS (1.000,00 €).</w:t></w:r></w:p><w:p><w:pPr><w:spacing w:after="180"/><w:jc w:val="both"/><w:rPr><w:rFonts w:ascii="Garamond" w:eastAsia="Garamond" w:hAnsi="Garamond" w:cs="Garamond"/><w:color w:val="1A2528"/></w:rPr></w:pPr><w:r><w:rPr><w:rFonts w:ascii="Garamond" w:eastAsia="Garamond" w:hAnsi="Garamond" w:cs="Garamond"/><w:color w:val="1A2528"/></w:rPr><w:t xml:space="preserve">Al formalizarse el contrato privado de arras penitenciales, la Parte Compradora entregará a la Parte Vendedora la cantidad equivalente al DIEZ POR CIENTO (10 %) del importe ofertado; el resto será entregado al formalizar la escritura pública de compraventa ante Notario.</w:t></w:r></w:p><w:p><w:pPr><w:spacing w:after="180"/><w:jc w:val="both"/><w:rPr><w:rFonts w:ascii="Garamond" w:eastAsia="Garamond" w:hAnsi="Garamond" w:cs="Garamond"/><w:color w:val="1A2528"/></w:rPr></w:pPr><w:r><w:rPr><w:rFonts w:ascii="Garamond" w:eastAsia="Garamond" w:hAnsi="Garamond" w:cs="Garamond"/><w:color w:val="1A2528"/></w:rPr><w:t xml:space="preserve">De indicarse alguna condición particular, la presente propuesta/reserva quedará sujeta a su aceptación expresa por la Parte Vendedora, con independencia de que el precio ofertado coincida con el de publicación.</w:t></w:r></w:p><w:p><w:pPr><w:spacing w:before="240" w:after="140"/></w:pPr><w:r><w:rPr><w:rFonts w:ascii="Calibri" w:eastAsia="Calibri" w:hAnsi="Calibri" w:cs="Calibri"/><w:b/><w:color w:val="405C6B"/><w:sz w:val="21"/></w:rPr><w:t xml:space="preserve">DATOS BANCARIOS PARA LA RESERVA</w:t></w:r></w:p><w:p><w:r><w:t xml:space="preserve">Banco: Banco Sabadell</w:t></w:r></w:p>
-<w:p><w:r><w:t xml:space="preserve">Titular: MALLORCA NATIVA, S.L.</w:t></w:r></w:p>
-<w:p><w:r><w:t xml:space="preserve">IBAN: ES30 0081 0268 2700 0248 1851</w:t></w:r></w:p>
-<w:p><w:r><w:t xml:space="preserve">Concepto: {nombre_comprador_1}</w:t></w:r></w:p><w:p><w:pPr><w:spacing w:after="120"/></w:pPr></w:p><w:p><w:pPr><w:spacing w:before="240" w:after="140"/></w:pPr><w:r><w:rPr><w:rFonts w:ascii="Calibri" w:eastAsia="Calibri" w:hAnsi="Calibri" w:cs="Calibri"/><w:b/><w:color w:val="405C6B"/><w:sz w:val="21"/></w:rPr><w:t>CONDICIONES</w:t></w:r></w:p><w:p><w:pPr><w:tabs><w:tab w:val="left" w:pos="142"/></w:tabs><w:spacing w:after="140"/><w:jc w:val="both"/></w:pPr><w:r><w:rPr><w:rFonts w:ascii="Garamond" w:eastAsia="Garamond" w:hAnsi="Garamond" w:cs="Garamond"/><w:color w:val="1A2528"/></w:rPr><w:t xml:space="preserve">-  La Parte Compradora y la Parte Vendedora se comprometen a firmar el correspondiente contrato privado de arras penitenciales en el plazo máximo de diez (10) días naturales, bajo los términos estipulados en el apartado “OFERTA / RESERVA” y “CONDICIONES”.</w:t></w:r></w:p><w:p><w:pPr><w:tabs><w:tab w:val="left" w:pos="142"/></w:tabs><w:spacing w:after="140"/><w:jc w:val="both"/></w:pPr><w:r><w:rPr><w:rFonts w:ascii="Garamond" w:eastAsia="Garamond" w:hAnsi="Garamond" w:cs="Garamond"/><w:color w:val="1A2528"/></w:rPr><w:t xml:space="preserve">-  La Parte Compradora se compromete, además, a otorgar la escritura pública de compraventa del inmueble antes o hasta un máximo de sesenta (60) días naturales a contar desde la firma del contrato privado de arras penitenciales.</w:t></w:r></w:p><w:p><w:pPr><w:tabs><w:tab w:val="left" w:pos="142"/></w:tabs><w:spacing w:after="140"/><w:jc w:val="both"/></w:pPr><w:r><w:rPr><w:rFonts w:ascii="Garamond" w:eastAsia="Garamond" w:hAnsi="Garamond" w:cs="Garamond"/><w:color w:val="1A2528"/></w:rPr><w:t xml:space="preserve">- La Parte Vendedora queda expresamente sujeta a las condiciones y estipulaciones del contrato de intermediación o reconocimiento de honorarios firmado previamente con Nativa Properties, comprometiéndose a cumplir con todas las obligaciones derivadas de dicho contrato.</w:t></w:r></w:p><w:p><w:pPr><w:tabs><w:tab w:val="left" w:pos="142"/></w:tabs><w:spacing w:after="140"/><w:jc w:val="both"/></w:pPr><w:r><w:rPr><w:rFonts w:ascii="Garamond" w:eastAsia="Garamond" w:hAnsi="Garamond" w:cs="Garamond"/><w:color w:val="1A2528"/></w:rPr><w:t xml:space="preserve">-  Si por causas imputables a la Parte Compradora no se llegara a formalizar el contrato privado de arras, ésta perderá la cantidad entregada en este acto a la Agencia, sin derecho a reclamar ni a la Agencia ni a la Parte Vendedora.</w:t></w:r></w:p><w:p><w:pPr><w:tabs><w:tab w:val="left" w:pos="142"/></w:tabs><w:spacing w:after="140"/><w:jc w:val="both"/><w:rPr><w:rFonts w:ascii="Garamond" w:eastAsia="Garamond" w:hAnsi="Garamond" w:cs="Garamond"/><w:color w:val="1A2528"/></w:rPr></w:pPr><w:r><w:rPr><w:rFonts w:ascii="Garamond" w:eastAsia="Garamond" w:hAnsi="Garamond" w:cs="Garamond"/><w:color w:val="1A2528"/></w:rPr><w:t xml:space="preserve">-  En el supuesto excepcional de que la Parte Vendedora no confirmase las condiciones de la presente reserva, la Agencia devolverá el importe entregado por la Parte Compradora sin intereses, en un plazo máximo de cinco (5) días hábiles, sin que ésta tenga nada más que reclamar.</w:t></w:r></w:p><w:p><w:pPr><w:tabs><w:tab w:val="left" w:pos="142"/><w:tab w:val="left" w:pos="284"/></w:tabs><w:spacing w:after="140"/><w:jc w:val="both"/><w:rPr><w:rFonts w:ascii="Garamond" w:eastAsia="Garamond" w:hAnsi="Garamond" w:cs="Garamond"/><w:color w:val="1A2528"/></w:rPr></w:pPr><w:r><w:rPr><w:rFonts w:ascii="Garamond" w:eastAsia="Garamond" w:hAnsi="Garamond" w:cs="Garamond"/><w:color w:val="1A2528"/></w:rPr><w:t xml:space="preserve">- En caso de formalizarse el contrato privado de arras penitenciales conforme a lo estipulado en el apartado anterior, la cantidad de MIL EUROS (1.000,00 €) entregada en concepto de reserva será devuelta a la Parte Compradora una vez la Agencia haya confirmado el ingreso correspondiente a las arras, sin que dicho importe compute como parte del diez por ciento (10 %) pactado</w:t></w:r></w:p><w:p><w:pPr><w:spacing w:before="240" w:after="140"/><w:rPr><w:rFonts w:ascii="Calibri" w:eastAsia="Calibri" w:hAnsi="Calibri" w:cs="Calibri"/><w:b/><w:color w:val="405C6B"/><w:sz w:val="21"/></w:rPr></w:pPr><w:r><w:rPr><w:rFonts w:ascii="Calibri" w:eastAsia="Calibri" w:hAnsi="Calibri" w:cs="Calibri"/><w:b/><w:color w:val="405C6B"/><w:sz w:val="21"/></w:rPr><w:t xml:space="preserve">CONDICIONES PARTICULARES SOLICITADAS POR LA PARTE COMPRADORA (VOLUNTARIO){condiciones_particulares}</w:t></w:r></w:p><w:p><w:pPr><w:spacing w:before="240" w:after="140"/><w:rPr><w:rFonts w:ascii="Calibri" w:eastAsia="Calibri" w:hAnsi="Calibri" w:cs="Calibri"/><w:b/><w:color w:val="405C6B"/><w:sz w:val="21"/></w:rPr></w:pPr></w:p><w:bookmarkEnd w:id="0"/><w:p><w:pPr><w:spacing w:before="240" w:after="140"/></w:pPr><w:r><w:rPr><w:rFonts w:ascii="Calibri" w:eastAsia="Calibri" w:hAnsi="Calibri" w:cs="Calibri"/><w:b/><w:color w:val="405C6B"/><w:sz w:val="21"/></w:rPr><w:t xml:space="preserve">PROTECCIÓN DE DATOS Y CONSENTIMIENTO</w:t></w:r></w:p><w:p><w:pPr><w:spacing w:after="180"/><w:jc w:val="both"/></w:pPr><w:r><w:rPr><w:rFonts w:ascii="Garamond" w:eastAsia="Garamond" w:hAnsi="Garamond" w:cs="Garamond"/><w:color w:val="1A2528"/></w:rPr><w:t xml:space="preserve">De conformidad con el Reglamento (UE) 2016/679 y la Ley Orgánica 3/2018, se informa de que los datos recogidos serán tratados por Mallorca Nativa, S.L. (Nativa Properties) como responsable del tratamiento, con la finalidad de gestionar la presente reserva. Podrá ejercer sus derechos de acceso, rectificación, cancelación y oposición mediante escrito firmado, junto con copia de su DNI, a info@mallorcanativaproperties.com.</w:t></w:r></w:p><w:p><w:pPr><w:spacing w:after="180"/><w:jc w:val="both"/></w:pPr><w:r><w:rPr><w:rFonts w:ascii="Garamond" w:eastAsia="Garamond" w:hAnsi="Garamond" w:cs="Garamond"/><w:color w:val="1A2528"/></w:rPr><w:t xml:space="preserve">En caso de discrepancia, contradicción o incoherencia entre una eventual versión en idioma inglés y la presente versión en idioma español, prevalecerá siempre la versión redactada en idioma español, que será la considerada como texto oficial y vinculante para todas las partes.</w:t></w:r></w:p><w:p><w:pPr><w:spacing w:before="240" w:after="140"/></w:pPr><w:r><w:rPr><w:rFonts w:ascii="Calibri" w:eastAsia="Calibri" w:hAnsi="Calibri" w:cs="Calibri"/><w:b/><w:color w:val="405C6B"/><w:sz w:val="21"/></w:rPr><w:t xml:space="preserve">RESPUESTA DE LA PARTE VENDEDORA (solo incluir si hay CONDICIONES PARTICULARES, SI NO HAY CONDICIONES PARTICULARES EL VENDEDOR SOLO FIRMA RECEPCIÓN DE RESERVA)</w:t></w:r></w:p><w:p><w:pPr><w:spacing w:after="180"/></w:pPr><w:r><w:rPr><w:rFonts w:ascii="Calibri" w:eastAsia="Garamond" w:hAnsi="Calibri" w:cs="Calibri"/><w:color w:val="1A2528"/></w:rPr><w:t xml:space="preserve">{acepta_propuesta} Acepta       {no_acepta_propuesta} No acepta      </w:t></w:r></w:p><w:p><w:pPr><w:spacing w:after="140"/></w:pPr><w:r><w:rPr><w:rFonts w:ascii="Calibri" w:eastAsia="Calibri" w:hAnsi="Calibri" w:cs="Calibri"/><w:b/><w:color w:val="405C6B"/><w:sz w:val="21"/></w:rPr><w:t xml:space="preserve">FIRMAS DE CONFORMIDAD</w:t></w:r></w:p><w:tbl><w:tblPr><w:tblStyle w:val="TableGrid"/><w:tblW w:w="8502" w:type="dxa"/><w:tblBorders><w:top w:val="none" w:sz="0" w:space="0" w:color="auto"/><w:left w:val="none" w:sz="0" w:space="0" w:color="auto"/><w:bottom w:val="none" w:sz="0" w:space="0" w:color="auto"/><w:right w:val="none" w:sz="0" w:space="0" w:color="auto"/><w:insideH w:val="none" w:sz="0" w:space="0" w:color="auto"/><w:insideV w:val="none" w:sz="0" w:space="0" w:color="auto"/></w:tblBorders><w:tblCellMar><w:left w:w="0" w:type="dxa"/><w:right w:w="0" w:type="dxa"/></w:tblCellMar></w:tblPr><w:tblGrid><w:gridCol w:w="2834"/><w:gridCol w:w="2834"/><w:gridCol w:w="2834"/></w:tblGrid><w:tr><w:tc><w:tcPr><w:tcW w:w="2834" w:type="dxa"/></w:tcPr><w:p><w:pPr><w:spacing w:before="1200" w:after="0"/><w:jc w:val="center"/></w:pPr><w:r><w:rPr><w:rFonts w:ascii="Calibri" w:hAnsi="Calibri"/><w:sz w:val="18"/><w:color w:val="405C6B"/></w:rPr><w:t>Firma Interesados (Comprador)</w:t></w:r></w:p></w:tc><w:tc><w:tcPr><w:tcW w:w="2834" w:type="dxa"/></w:tcPr><w:p><w:pPr><w:spacing w:before="1200" w:after="0"/><w:jc w:val="center"/></w:pPr><w:r><w:rPr><w:rFonts w:ascii="Calibri" w:hAnsi="Calibri"/><w:sz w:val="18"/><w:color w:val="405C6B"/></w:rPr><w:t>Firma del Agente Inmobiliario</w:t></w:r></w:p></w:tc><w:tc><w:tcPr><w:tcW w:w="2834" w:type="dxa"/></w:tcPr><w:p><w:pPr><w:spacing w:before="1200" w:after="0"/><w:jc w:val="center"/></w:pPr><w:r><w:rPr><w:rFonts w:ascii="Calibri" w:hAnsi="Calibri"/><w:sz w:val="18"/><w:color w:val="405C6B"/></w:rPr><w:t>Firma del Propietario</w:t></w:r></w:p></w:tc></w:tr></w:tbl><w:p><w:pPr><w:spacing w:after="120"/></w:pPr></w:p><w:sectPr><w:footerReference w:type="default" r:id="rId7"/><w:pgSz w:w="11906" w:h="16838"/><w:pgMar w:top="1417" w:right="1701" w:bottom="1417" w:left="1701" w:header="708" w:footer="708" w:gutter="0"/><w:cols w:space="720"/><w:docGrid w:linePitch="360"/></w:sectPr></w:body></w:document>
+<file path=word/document.xml><?xml version="1.0" encoding="utf-8"?>
+<w:document xmlns:wpc="http://schemas.microsoft.com/office/word/2010/wordprocessingCanvas" xmlns:cx="http://schemas.microsoft.com/office/drawing/2014/chartex" xmlns:cx1="http://schemas.microsoft.com/office/drawing/2015/9/8/chartex" xmlns:cx2="http://schemas.microsoft.com/office/drawing/2015/10/21/chartex" xmlns:cx3="http://schemas.microsoft.com/office/drawing/2016/5/9/chartex" xmlns:cx4="http://schemas.microsoft.com/office/drawing/2016/5/10/chartex" xmlns:cx5="http://schemas.microsoft.com/office/drawing/2016/5/11/chartex" xmlns:cx6="http://schemas.microsoft.com/office/drawing/2016/5/12/chartex" xmlns:cx7="http://schemas.microsoft.com/office/drawing/2016/5/13/chartex" xmlns:cx8="http://schemas.microsoft.com/office/drawing/2016/5/14/chartex" xmlns:mc="http://schemas.openxmlformats.org/markup-compatibility/2006" xmlns:aink="http://schemas.microsoft.com/office/drawing/2016/ink" xmlns:am3d="http://schemas.microsoft.com/office/drawing/2017/model3d" xmlns:o="urn:schemas-microsoft-com:office:office" xmlns:r="http://schemas.openxmlformats.org/officeDocument/2006/relationships" xmlns:m="http://schemas.openxmlformats.org/officeDocument/2006/math" xmlns:v="urn:schemas-microsoft-com:vml" xmlns:wp14="http://schemas.microsoft.com/office/word/2010/wordprocessingDrawing" xmlns:wp="http://schemas.openxmlformats.org/drawingml/2006/wordprocessingDrawing" xmlns:w10="urn:schemas-microsoft-com:office:word" xmlns:w="http://schemas.openxmlformats.org/wordprocessingml/2006/main" xmlns:w14="http://schemas.microsoft.com/office/word/2010/wordml" xmlns:w15="http://schemas.microsoft.com/office/word/2012/wordml" xmlns:w16cex="http://schemas.microsoft.com/office/word/2018/wordml/cex" xmlns:w16cid="http://schemas.microsoft.com/office/word/2016/wordml/cid" xmlns:w16="http://schemas.microsoft.com/office/word/2018/wordml" xmlns:w16sdtdh="http://schemas.microsoft.com/office/word/2020/wordml/sdtdatahash" xmlns:w16se="http://schemas.microsoft.com/office/word/2015/wordml/symex" xmlns:wpg="http://schemas.microsoft.com/office/word/2010/wordprocessingGroup" xmlns:wpi="http://schemas.microsoft.com/office/word/2010/wordprocessingInk" xmlns:wne="http://schemas.microsoft.com/office/word/2006/wordml" xmlns:wps="http://schemas.microsoft.com/office/word/2010/wordprocessingShape" mc:Ignorable="w14 w15 w16se w16cid w16 w16cex w16sdtdh wp14">
+  <w:body>
+    <w:p>
+      <w:pPr>
+        <w:spacing w:after="60"/>
+        <w:jc w:val="center"/>
+      </w:pPr>
+      <w:r>
+        <w:rPr>
+          <w:rFonts w:ascii="Calibri" w:eastAsia="Calibri" w:hAnsi="Calibri" w:cs="Calibri"/>
+          <w:b/>
+          <w:color w:val="8F7141"/>
+          <w:sz w:val="18"/>
+        </w:rPr>
+        <w:t xml:space="preserve">NATIVA PROPERTIES</w:t>
+      </w:r>
+    </w:p>
+    <w:p>
+      <w:pPr>
+        <w:pBdr>
+          <w:bottom w:val="single" w:sz="10" w:space="0" w:color="405C6B"/>
+        </w:pBdr>
+        <w:spacing w:after="80"/>
+        <w:jc w:val="center"/>
+      </w:pPr>
+      <w:r>
+        <w:rPr>
+          <w:rFonts w:ascii="Calibri" w:eastAsia="Calibri" w:hAnsi="Calibri" w:cs="Calibri"/>
+          <w:b/>
+          <w:color w:val="405C6B"/>
+          <w:sz w:val="30"/>
+        </w:rPr>
+        <w:t xml:space="preserve">RESERVA EXCLUSIVA</w:t>
+      </w:r>
+    </w:p>
+    <w:p>
+      <w:pPr>
+        <w:spacing w:after="320"/>
+        <w:jc w:val="center"/>
+      </w:pPr>
+      <w:r>
+        <w:rPr>
+          <w:rFonts w:ascii="Garamond" w:eastAsia="Garamond" w:hAnsi="Garamond" w:cs="Garamond"/>
+          <w:i/>
+          <w:color w:val="555555"/>
+        </w:rPr>
+        <w:t xml:space="preserve">Reserva en firme al precio de publicación del inmueble</w:t>
+      </w:r>
+    </w:p>
+    <w:p>
+      <w:pPr>
+        <w:spacing w:after="280"/>
+      </w:pPr>
+      <w:r>
+        <w:rPr>
+          <w:rFonts w:ascii="Garamond" w:eastAsia="Garamond" w:hAnsi="Garamond" w:cs="Garamond"/>
+          <w:color w:val="1A2528"/>
+        </w:rPr>
+        <w:t xml:space="preserve">En {ciudad}, a {dia} de {mes} de {anyo}</w:t>
+      </w:r>
+    </w:p>
+    <w:p>
+      <w:pPr>
+        <w:spacing w:after="140"/>
+      </w:pPr>
+      <w:r>
+        <w:rPr>
+          <w:rFonts w:ascii="Calibri" w:eastAsia="Calibri" w:hAnsi="Calibri" w:cs="Calibri"/>
+          <w:b/>
+          <w:color w:val="405C6B"/>
+          <w:sz w:val="21"/>
+        </w:rPr>
+        <w:t xml:space="preserve">INMUEBLE VISITADO</w:t>
+      </w:r>
+    </w:p>
+    <w:p>
+      <w:r>
+        <w:t>Dirección: {direccion}</w:t>
+      </w:r>
+    </w:p>
+    <w:p>
+      <w:r>
+        <w:t xml:space="preserve">Referencia catastral: {ref_catastral}</w:t>
+      </w:r>
+    </w:p>
+    <w:p>
+      <w:r>
+        <w:t xml:space="preserve">Referencia Interna: {ref_interna}</w:t>
+      </w:r>
+    </w:p>
+    <w:p>
+      <w:r>
+        <w:t xml:space="preserve">Precio publicación: {precio_publicacion}</w:t>
+      </w:r>
+    </w:p>
+    <w:p>
+      <w:pPr>
+        <w:spacing w:after="120"/>
+      </w:pPr>
+    </w:p>
+    <w:p>
+      <w:pPr>
+        <w:spacing w:before="240" w:after="140"/>
+      </w:pPr>
+      <w:r>
+        <w:rPr>
+          <w:rFonts w:ascii="Calibri" w:eastAsia="Calibri" w:hAnsi="Calibri" w:cs="Calibri"/>
+          <w:b/>
+          <w:color w:val="405C6B"/>
+          <w:sz w:val="21"/>
+        </w:rPr>
+        <w:t xml:space="preserve">DATOS DEL AGENTE</w:t>
+      </w:r>
+    </w:p>
+    <w:p>
+      <w:pPr>
+        <w:spacing w:after="180"/>
+        <w:jc w:val="both"/>
+      </w:pPr>
+      <w:r>
+        <w:rPr>
+          <w:rFonts w:ascii="Garamond" w:eastAsia="Garamond" w:hAnsi="Garamond" w:cs="Garamond"/>
+          <w:color w:val="1A2528"/>
+        </w:rPr>
+        <w:t xml:space="preserve">D./Dña. {nombre_agente}, con DNI/NIE {dni_agente} y Nº Póliza RC {poliza_rc_agente}, actuando como Agente Independiente en Colaboración con Nativa Properties (Mallorca Nativa, S.L., CIF B75396234), ha acompañado y asesorado al interesado en la visita al inmueble anteriormente descrito.</w:t>
+      </w:r>
+    </w:p>
+    <w:p>
+      <w:pPr>
+        <w:spacing w:before="240" w:after="140"/>
+      </w:pPr>
+      <w:r>
+        <w:rPr>
+          <w:rFonts w:ascii="Calibri" w:eastAsia="Calibri" w:hAnsi="Calibri" w:cs="Calibri"/>
+          <w:b/>
+          <w:color w:val="405C6B"/>
+          <w:sz w:val="21"/>
+        </w:rPr>
+        <w:t xml:space="preserve">DATOS DEL INTERESADO (COMPRADOR POTENCIAL)</w:t>
+      </w:r>
+    </w:p>
+    <w:p>
+      <w:r>
+        <w:t xml:space="preserve">Nombre y Apellidos: {nombre_comprador_1}</w:t>
+      </w:r>
+    </w:p>
+    <w:p>
+      <w:r>
+        <w:t xml:space="preserve">DNI/NIE: {dni_comprador_1}</w:t>
+      </w:r>
+    </w:p>
+    <w:p>
+      <w:r>
+        <w:t xml:space="preserve">Teléfono: {telefono_comprador_1}</w:t>
+      </w:r>
+    </w:p>
+    <w:p>
+      <w:r>
+        <w:t xml:space="preserve">Nombre y Apellidos: {nombre_comprador_2}</w:t>
+      </w:r>
+    </w:p>
+    <w:p>
+      <w:r>
+        <w:t xml:space="preserve">DNI/NIE: {dni_comprador_2}</w:t>
+      </w:r>
+    </w:p>
+    <w:p>
+      <w:r>
+        <w:t xml:space="preserve">Teléfono: {telefono_comprador_2}</w:t>
+      </w:r>
+    </w:p>
+    <w:p>
+      <w:pPr>
+        <w:spacing w:after="120"/>
+      </w:pPr>
+    </w:p>
+    <w:p>
+      <w:pPr>
+        <w:spacing w:before="240" w:after="140"/>
+      </w:pPr>
+      <w:r>
+        <w:rPr>
+          <w:rFonts w:ascii="Calibri" w:eastAsia="Calibri" w:hAnsi="Calibri" w:cs="Calibri"/>
+          <w:b/>
+          <w:color w:val="405C6B"/>
+          <w:sz w:val="21"/>
+        </w:rPr>
+        <w:t xml:space="preserve">DECLARACIÓN DEL INTERESADO</w:t>
+      </w:r>
+    </w:p>
+    <w:p>
+      <w:pPr>
+        <w:spacing w:after="180"/>
+        <w:jc w:val="both"/>
+      </w:pPr>
+      <w:r>
+        <w:rPr>
+          <w:rFonts w:ascii="Garamond" w:eastAsia="Garamond" w:hAnsi="Garamond" w:cs="Garamond"/>
+          <w:color w:val="1A2528"/>
+        </w:rPr>
+        <w:t xml:space="preserve">El interesado declara haber conocido y visitado el inmueble anteriormente descrito gracias a la gestión y difusión comercial de Nativa Properties (Mallorca Nativa, S.L., CIF B75396234).</w:t>
+      </w:r>
+    </w:p>
+    <w:p>
+      <w:pPr>
+        <w:spacing w:after="180"/>
+        <w:jc w:val="both"/>
+      </w:pPr>
+      <w:r>
+        <w:rPr>
+          <w:rFonts w:ascii="Garamond" w:eastAsia="Garamond" w:hAnsi="Garamond" w:cs="Garamond"/>
+          <w:color w:val="1A2528"/>
+        </w:rPr>
+        <w:t xml:space="preserve">Con el fin de poder ofrecer al interesado un acompañamiento continuado a lo largo de todo el proceso, y de proteger igualmente los intereses de la propiedad, el interesado se compromete a comunicarse exclusivamente con Nativa Properties para cualquier asunto relacionado con el inmueble citado. En ningún caso deberá contactar con los propietarios sin la presencia de un representante de la Agencia, ni divulgar los datos de la propiedad a terceros, especialmente a otras agencias intermediarias. Asimismo, el interesado no podrá adquirir la propiedad de forma personal, a través de familiares, de sociedades bajo su control efectivo, o de otras personas vinculadas, sin la intervención de Nativa Properties.</w:t>
+      </w:r>
+    </w:p>
+    <w:p>
+      <w:pPr>
+        <w:spacing w:before="240" w:after="140"/>
+      </w:pPr>
+      <w:r>
+        <w:rPr>
+          <w:rFonts w:ascii="Calibri" w:eastAsia="Calibri" w:hAnsi="Calibri" w:cs="Calibri"/>
+          <w:b/>
+          <w:color w:val="405C6B"/>
+          <w:sz w:val="21"/>
+        </w:rPr>
+        <w:t xml:space="preserve">OFERTA / RESERVA</w:t>
+      </w:r>
+    </w:p>
+    <w:p>
+      <w:pPr>
+        <w:spacing w:after="80"/>
+        <w:jc w:val="both"/>
+      </w:pPr>
+      <w:r>
+        <w:rPr>
+          <w:rFonts w:ascii="Garamond" w:eastAsia="Garamond" w:hAnsi="Garamond" w:cs="Garamond"/>
+          <w:color w:val="1A2528"/>
+        </w:rPr>
+        <w:t xml:space="preserve">La Parte Compradora ofrece pagar a la Parte Vendedora, en concepto de precio de compraventa del inmueble, la cantidad de:</w:t>
+      </w:r>
+    </w:p>
+    <w:p>
+      <w:pPr>
+        <w:spacing w:after="80"/>
+      </w:pPr>
+      <w:r>
+        <w:rPr>
+          <w:rFonts w:ascii="Garamond" w:eastAsia="Garamond" w:hAnsi="Garamond" w:cs="Garamond"/>
+          <w:color w:val="999999"/>
+        </w:rPr>
+        <w:t xml:space="preserve">{precio_oferta_largo}</w:t>
+      </w:r>
+    </w:p>
+    <w:p>
+      <w:pPr>
+        <w:spacing w:after="180"/>
+        <w:jc w:val="both"/>
+      </w:pPr>
+      <w:r>
+        <w:rPr>
+          <w:rFonts w:ascii="Garamond" w:eastAsia="Garamond" w:hAnsi="Garamond" w:cs="Garamond"/>
+          <w:color w:val="1A2528"/>
+        </w:rPr>
+        <w:t xml:space="preserve">correspondiente al precio íntegro de publicación, honorarios de intermediación incluidos.</w:t>
+      </w:r>
+    </w:p>
+    <w:p>
+      <w:pPr>
+        <w:spacing w:after="180"/>
+        <w:jc w:val="both"/>
+      </w:pPr>
+      <w:r>
+        <w:rPr>
+          <w:rFonts w:ascii="Garamond" w:eastAsia="Garamond" w:hAnsi="Garamond" w:cs="Garamond"/>
+          <w:color w:val="1A2528"/>
+        </w:rPr>
+        <w:t xml:space="preserve">Con el fin de formalizar esta reserva, la Parte Compradora entrega en este acto a la Agencia, en concepto de reserva del inmueble, la cantidad de MIL EUROS (1.000,00 €).</w:t>
+      </w:r>
+    </w:p>
+    <w:p>
+      <w:pPr>
+        <w:spacing w:after="180"/>
+        <w:jc w:val="both"/>
+        <w:rPr>
+          <w:rFonts w:ascii="Garamond" w:eastAsia="Garamond" w:hAnsi="Garamond" w:cs="Garamond"/>
+          <w:color w:val="1A2528"/>
+        </w:rPr>
+      </w:pPr>
+      <w:r>
+        <w:rPr>
+          <w:rFonts w:ascii="Garamond" w:eastAsia="Garamond" w:hAnsi="Garamond" w:cs="Garamond"/>
+          <w:color w:val="1A2528"/>
+        </w:rPr>
+        <w:t xml:space="preserve">Al formalizarse el contrato privado de arras penitenciales, la Parte Compradora entregará a la Parte Vendedora la cantidad equivalente al DIEZ POR CIENTO (10 %) del importe ofertado; el resto será entregado al formalizar la escritura pública de compraventa ante Notario.</w:t>
+      </w:r>
+    </w:p>
+    <w:p>
+      <w:pPr>
+        <w:spacing w:after="180"/>
+        <w:jc w:val="both"/>
+        <w:rPr>
+          <w:rFonts w:ascii="Garamond" w:eastAsia="Garamond" w:hAnsi="Garamond" w:cs="Garamond"/>
+          <w:color w:val="1A2528"/>
+        </w:rPr>
+      </w:pPr>
+      <w:r>
+        <w:rPr>
+          <w:rFonts w:ascii="Garamond" w:eastAsia="Garamond" w:hAnsi="Garamond" w:cs="Garamond"/>
+          <w:color w:val="1A2528"/>
+        </w:rPr>
+        <w:t xml:space="preserve">De indicarse alguna condición particular, la presente propuesta/reserva quedará sujeta a su aceptación expresa por la Parte Vendedora, con independencia de que el precio ofertado coincida con el de publicación.</w:t>
+      </w:r>
+    </w:p>
+    <w:p>
+      <w:pPr>
+        <w:spacing w:before="240" w:after="140"/>
+      </w:pPr>
+      <w:r>
+        <w:rPr>
+          <w:rFonts w:ascii="Calibri" w:eastAsia="Calibri" w:hAnsi="Calibri" w:cs="Calibri"/>
+          <w:b/>
+          <w:color w:val="405C6B"/>
+          <w:sz w:val="21"/>
+        </w:rPr>
+        <w:t xml:space="preserve">DATOS BANCARIOS PARA LA RESERVA</w:t>
+      </w:r>
+    </w:p>
+    <w:p>
+      <w:r>
+        <w:t xml:space="preserve">Banco: Banco Sabadell</w:t>
+      </w:r>
+    </w:p>
+    <w:p>
+      <w:r>
+        <w:t xml:space="preserve">Titular: MALLORCA NATIVA, S.L.</w:t>
+      </w:r>
+    </w:p>
+    <w:p>
+      <w:r>
+        <w:t xml:space="preserve">IBAN: ES30 0081 0268 2700 0248 1851</w:t>
+      </w:r>
+    </w:p>
+    <w:p>
+      <w:r>
+        <w:t xml:space="preserve">Concepto: {nombre_comprador_1}</w:t>
+      </w:r>
+    </w:p>
+    <w:p>
+      <w:pPr>
+        <w:spacing w:after="120"/>
+      </w:pPr>
+    </w:p>
+    <w:p>
+      <w:pPr>
+        <w:spacing w:before="240" w:after="140"/>
+      </w:pPr>
+      <w:r>
+        <w:rPr>
+          <w:rFonts w:ascii="Calibri" w:eastAsia="Calibri" w:hAnsi="Calibri" w:cs="Calibri"/>
+          <w:b/>
+          <w:color w:val="405C6B"/>
+          <w:sz w:val="21"/>
+        </w:rPr>
+        <w:t>CONDICIONES</w:t>
+      </w:r>
+    </w:p>
+    <w:p>
+      <w:pPr>
+        <w:tabs>
+          <w:tab w:val="left" w:pos="142"/>
+        </w:tabs>
+        <w:spacing w:after="140"/>
+        <w:jc w:val="both"/>
+      </w:pPr>
+      <w:r>
+        <w:rPr>
+          <w:rFonts w:ascii="Garamond" w:eastAsia="Garamond" w:hAnsi="Garamond" w:cs="Garamond"/>
+          <w:color w:val="1A2528"/>
+        </w:rPr>
+        <w:t xml:space="preserve">-  La Parte Compradora y la Parte Vendedora se comprometen a firmar el correspondiente contrato privado de arras penitenciales en el plazo máximo de diez (10) días naturales, bajo los términos estipulados en el apartado “OFERTA / RESERVA” y “CONDICIONES”.</w:t>
+      </w:r>
+    </w:p>
+    <w:p>
+      <w:pPr>
+        <w:tabs>
+          <w:tab w:val="left" w:pos="142"/>
+        </w:tabs>
+        <w:spacing w:after="140"/>
+        <w:jc w:val="both"/>
+      </w:pPr>
+      <w:r>
+        <w:rPr>
+          <w:rFonts w:ascii="Garamond" w:eastAsia="Garamond" w:hAnsi="Garamond" w:cs="Garamond"/>
+          <w:color w:val="1A2528"/>
+        </w:rPr>
+        <w:t xml:space="preserve">-  La Parte Compradora se compromete, además, a otorgar la escritura pública de compraventa del inmueble antes o hasta un máximo de sesenta (60) días naturales a contar desde la firma del contrato privado de arras penitenciales.</w:t>
+      </w:r>
+    </w:p>
+    <w:p>
+      <w:pPr>
+        <w:tabs>
+          <w:tab w:val="left" w:pos="142"/>
+        </w:tabs>
+        <w:spacing w:after="140"/>
+        <w:jc w:val="both"/>
+      </w:pPr>
+      <w:r>
+        <w:rPr>
+          <w:rFonts w:ascii="Garamond" w:eastAsia="Garamond" w:hAnsi="Garamond" w:cs="Garamond"/>
+          <w:color w:val="1A2528"/>
+        </w:rPr>
+        <w:t xml:space="preserve">- La Parte Vendedora queda expresamente sujeta a las condiciones y estipulaciones del contrato de intermediación o reconocimiento de honorarios firmado previamente con Nativa Properties, comprometiéndose a cumplir con todas las obligaciones derivadas de dicho contrato.</w:t>
+      </w:r>
+    </w:p>
+    <w:p>
+      <w:pPr>
+        <w:tabs>
+          <w:tab w:val="left" w:pos="142"/>
+        </w:tabs>
+        <w:spacing w:after="140"/>
+        <w:jc w:val="both"/>
+      </w:pPr>
+      <w:r>
+        <w:rPr>
+          <w:rFonts w:ascii="Garamond" w:eastAsia="Garamond" w:hAnsi="Garamond" w:cs="Garamond"/>
+          <w:color w:val="1A2528"/>
+        </w:rPr>
+        <w:t xml:space="preserve">-  Si por causas imputables a la Parte Compradora no se llegara a formalizar el contrato privado de arras, ésta perderá la cantidad entregada en este acto a la Agencia, sin derecho a reclamar ni a la Agencia ni a la Parte Vendedora.</w:t>
+      </w:r>
+    </w:p>
+    <w:p>
+      <w:pPr>
+        <w:tabs>
+          <w:tab w:val="left" w:pos="142"/>
+        </w:tabs>
+        <w:spacing w:after="140"/>
+        <w:jc w:val="both"/>
+        <w:rPr>
+          <w:rFonts w:ascii="Garamond" w:eastAsia="Garamond" w:hAnsi="Garamond" w:cs="Garamond"/>
+          <w:color w:val="1A2528"/>
+        </w:rPr>
+      </w:pPr>
+      <w:r>
+        <w:rPr>
+          <w:rFonts w:ascii="Garamond" w:eastAsia="Garamond" w:hAnsi="Garamond" w:cs="Garamond"/>
+          <w:color w:val="1A2528"/>
+        </w:rPr>
+        <w:t xml:space="preserve">-  En el supuesto excepcional de que la Parte Vendedora no confirmase las condiciones de la presente reserva, la Agencia devolverá el importe entregado por la Parte Compradora sin intereses, en un plazo máximo de cinco (5) días hábiles, sin que ésta tenga nada más que reclamar.</w:t>
+      </w:r>
+    </w:p>
+    <w:p>
+      <w:pPr>
+        <w:tabs>
+          <w:tab w:val="left" w:pos="142"/>
+          <w:tab w:val="left" w:pos="284"/>
+        </w:tabs>
+        <w:spacing w:after="140"/>
+        <w:jc w:val="both"/>
+        <w:rPr>
+          <w:rFonts w:ascii="Garamond" w:eastAsia="Garamond" w:hAnsi="Garamond" w:cs="Garamond"/>
+          <w:color w:val="1A2528"/>
+        </w:rPr>
+      </w:pPr>
+      <w:r>
+        <w:rPr>
+          <w:rFonts w:ascii="Garamond" w:eastAsia="Garamond" w:hAnsi="Garamond" w:cs="Garamond"/>
+          <w:color w:val="1A2528"/>
+        </w:rPr>
+        <w:t xml:space="preserve">- En caso de formalizarse el contrato privado de arras penitenciales conforme a lo estipulado en el apartado anterior, la cantidad de MIL EUROS (1.000,00 €) entregada en concepto de reserva será devuelta a la Parte Compradora una vez la Agencia haya confirmado el ingreso correspondiente a las arras, sin que dicho importe compute como parte del diez por ciento (10 %) pactado</w:t>
+      </w:r>
+    </w:p>
+    <w:p>
+      <w:pPr>
+        <w:spacing w:before="240" w:after="140"/>
+        <w:rPr>
+          <w:rFonts w:ascii="Calibri" w:eastAsia="Calibri" w:hAnsi="Calibri" w:cs="Calibri"/>
+          <w:b/>
+          <w:color w:val="405C6B"/>
+          <w:sz w:val="21"/>
+        </w:rPr>
+      </w:pPr>
+      <w:r>
+        <w:rPr>
+          <w:rFonts w:ascii="Calibri" w:eastAsia="Calibri" w:hAnsi="Calibri" w:cs="Calibri"/>
+          <w:b/>
+          <w:color w:val="405C6B"/>
+          <w:sz w:val="21"/>
+        </w:rPr>
+        <w:t xml:space="preserve">CONDICIONES PARTICULARES SOLICITADAS POR LA PARTE COMPRADORA (VOLUNTARIO){condiciones_particulares}</w:t>
+      </w:r>
+    </w:p>
+    <w:p>
+      <w:pPr>
+        <w:spacing w:before="240" w:after="140"/>
+        <w:rPr>
+          <w:rFonts w:ascii="Calibri" w:eastAsia="Calibri" w:hAnsi="Calibri" w:cs="Calibri"/>
+          <w:b/>
+          <w:color w:val="405C6B"/>
+          <w:sz w:val="21"/>
+        </w:rPr>
+      </w:pPr>
+    </w:p>
+    <w:bookmarkEnd w:id="0"/>
+    <w:p>
+      <w:pPr>
+        <w:spacing w:before="240" w:after="140"/>
+      </w:pPr>
+      <w:r>
+        <w:rPr>
+          <w:rFonts w:ascii="Calibri" w:eastAsia="Calibri" w:hAnsi="Calibri" w:cs="Calibri"/>
+          <w:b/>
+          <w:color w:val="405C6B"/>
+          <w:sz w:val="21"/>
+        </w:rPr>
+        <w:t xml:space="preserve">PROTECCIÓN DE DATOS Y CONSENTIMIENTO</w:t>
+      </w:r>
+    </w:p>
+    <w:p>
+      <w:pPr>
+        <w:spacing w:after="180"/>
+        <w:jc w:val="both"/>
+      </w:pPr>
+      <w:r>
+        <w:rPr>
+          <w:rFonts w:ascii="Garamond" w:eastAsia="Garamond" w:hAnsi="Garamond" w:cs="Garamond"/>
+          <w:color w:val="1A2528"/>
+        </w:rPr>
+        <w:t xml:space="preserve">De conformidad con el Reglamento (UE) 2016/679 y la Ley Orgánica 3/2018, se informa de que los datos recogidos serán tratados por Mallorca Nativa, S.L. (Nativa Properties) como responsable del tratamiento, con la finalidad de gestionar la presente reserva. Podrá ejercer sus derechos de acceso, rectificación, cancelación y oposición mediante escrito firmado, junto con copia de su DNI, a info@mallorcanativaproperties.com.</w:t>
+      </w:r>
+    </w:p>
+    <w:p>
+      <w:pPr>
+        <w:spacing w:after="180"/>
+        <w:jc w:val="both"/>
+      </w:pPr>
+      <w:r>
+        <w:rPr>
+          <w:rFonts w:ascii="Garamond" w:eastAsia="Garamond" w:hAnsi="Garamond" w:cs="Garamond"/>
+          <w:color w:val="1A2528"/>
+        </w:rPr>
+        <w:t xml:space="preserve">En caso de discrepancia, contradicción o incoherencia entre una eventual versión en idioma inglés y la presente versión en idioma español, prevalecerá siempre la versión redactada en idioma español, que será la considerada como texto oficial y vinculante para todas las partes.</w:t>
+      </w:r>
+    </w:p>
+    <w:p>
+      <w:pPr>
+        <w:spacing w:before="240" w:after="140"/>
+      </w:pPr>
+      <w:r>
+        <w:rPr>
+          <w:rFonts w:ascii="Calibri" w:eastAsia="Calibri" w:hAnsi="Calibri" w:cs="Calibri"/>
+          <w:b/>
+          <w:color w:val="405C6B"/>
+          <w:sz w:val="21"/>
+        </w:rPr>
+        <w:t xml:space="preserve">RESPUESTA DE LA PARTE VENDEDORA (solo incluir si hay CONDICIONES PARTICULARES, SI NO HAY CONDICIONES PARTICULARES EL VENDEDOR SOLO FIRMA RECEPCIÓN DE RESERVA)</w:t>
+      </w:r>
+    </w:p>
+    <w:p>
+      <w:pPr>
+        <w:spacing w:after="180"/>
+      </w:pPr>
+      <w:r>
+        <w:rPr>
+          <w:rFonts w:ascii="Calibri" w:eastAsia="Garamond" w:hAnsi="Calibri" w:cs="Calibri"/>
+          <w:color w:val="1A2528"/>
+        </w:rPr>
+        <w:t xml:space="preserve">{acepta_propuesta} Acepta       {no_acepta_propuesta} No acepta      </w:t>
+      </w:r>
+    </w:p>
+    <w:p>
+      <w:pPr>
+        <w:spacing w:after="140"/>
+      </w:pPr>
+      <w:r>
+        <w:rPr>
+          <w:rFonts w:ascii="Calibri" w:eastAsia="Calibri" w:hAnsi="Calibri" w:cs="Calibri"/>
+          <w:b/>
+          <w:color w:val="405C6B"/>
+          <w:sz w:val="21"/>
+        </w:rPr>
+        <w:t xml:space="preserve">FIRMAS DE CONFORMIDAD</w:t>
+      </w:r>
+    </w:p>
+    <w:tbl>
+      <w:tblPr>
+        <w:tblStyle w:val="TableGrid"/>
+        <w:tblW w:w="8502" w:type="dxa"/>
+        <w:tblBorders>
+          <w:top w:val="none" w:sz="0" w:space="0" w:color="auto"/>
+          <w:left w:val="none" w:sz="0" w:space="0" w:color="auto"/>
+          <w:bottom w:val="none" w:sz="0" w:space="0" w:color="auto"/>
+          <w:right w:val="none" w:sz="0" w:space="0" w:color="auto"/>
+          <w:insideH w:val="none" w:sz="0" w:space="0" w:color="auto"/>
+          <w:insideV w:val="none" w:sz="0" w:space="0" w:color="auto"/>
+        </w:tblBorders>
+        <w:tblCellMar>
+          <w:left w:w="0" w:type="dxa"/>
+          <w:right w:w="0" w:type="dxa"/>
+        </w:tblCellMar>
+      </w:tblPr>
+      <w:tblGrid>
+        <w:gridCol w:w="2834"/>
+        <w:gridCol w:w="2834"/>
+        <w:gridCol w:w="2834"/>
+      </w:tblGrid>
+      <w:tr>
+        <w:tc>
+          <w:tcPr>
+            <w:tcW w:w="2834" w:type="dxa"/>
+          </w:tcPr>
+          <w:p>
+            <w:pPr>
+              <w:spacing w:before="1200" w:after="0"/>
+              <w:jc w:val="center"/>
+            </w:pPr>
+            <w:r>
+              <w:rPr>
+                <w:rFonts w:ascii="Calibri" w:hAnsi="Calibri"/>
+                <w:sz w:val="18"/>
+                <w:color w:val="405C6B"/>
+              </w:rPr>
+              <w:t>Firma Interesados (Comprador)</w:t>
+            </w:r>
+          </w:p>
+        </w:tc>
+        <w:tc>
+          <w:tcPr>
+            <w:tcW w:w="2834" w:type="dxa"/>
+          </w:tcPr>
+          <w:p>
+            <w:pPr>
+              <w:spacing w:before="1200" w:after="0"/>
+              <w:jc w:val="center"/>
+            </w:pPr>
+            <w:r>
+              <w:rPr>
+                <w:rFonts w:ascii="Calibri" w:hAnsi="Calibri"/>
+                <w:sz w:val="18"/>
+                <w:color w:val="405C6B"/>
+              </w:rPr>
+              <w:t>Firma del Agente Inmobiliario</w:t>
+            </w:r>
+          </w:p>
+        </w:tc>
+        <w:tc>
+          <w:tcPr>
+            <w:tcW w:w="2834" w:type="dxa"/>
+          </w:tcPr>
+          <w:p>
+            <w:pPr>
+              <w:spacing w:before="1200" w:after="0"/>
+              <w:jc w:val="center"/>
+            </w:pPr>
+            <w:r>
+              <w:rPr>
+                <w:rFonts w:ascii="Calibri" w:hAnsi="Calibri"/>
+                <w:sz w:val="18"/>
+                <w:color w:val="405C6B"/>
+              </w:rPr>
+              <w:t>Firma del Propietario</w:t>
+            </w:r>
+          </w:p>
+        </w:tc>
+      </w:tr>
+    </w:tbl>
+    <w:p>
+      <w:pPr>
+        <w:spacing w:after="120"/>
+      </w:pPr>
+    </w:p>
+    <w:sectPr>
+      <w:footerReference w:type="default" r:id="rId7"/>
+      <w:pgSz w:w="11906" w:h="16838"/>
+      <w:pgMar w:top="1417" w:right="1701" w:bottom="1417" w:left="1701" w:header="708" w:footer="708" w:gutter="0"/>
+      <w:cols w:space="720"/>
+      <w:docGrid w:linePitch="360"/>
+    </w:sectPr>
+  </w:body>
+</w:document>
 </file>
 
 <file path=word/endnotes.xml><?xml version="1.0" encoding="utf-8"?>

</xml_diff>